<commit_message>
Add buildingSMART + SEED-AI to profile credentials and CV (regenerated PDF); align ACES end date in CV
</commit_message>
<xml_diff>
--- a/Assets/Profile/Krishiraj Santchurn Resume.docx
+++ b/Assets/Profile/Krishiraj Santchurn Resume.docx
@@ -317,6 +317,80 @@
       <w:pPr>
         <w:rPr>
           <w:rFonts w:ascii="Arial" w:hAnsi="Arial" w:cs="Arial"/>
+          <w:sz w:val="20"/>
+          <w:szCs w:val="20"/>
+        </w:rPr>
+      </w:pPr>
+      <w:r>
+        <w:rPr>
+          <w:rFonts w:ascii="Arial" w:hAnsi="Arial" w:cs="Arial"/>
+          <w:b/>
+          <w:bCs/>
+          <w:sz w:val="20"/>
+          <w:szCs w:val="20"/>
+        </w:rPr>
+        <w:t>buildingSMART – Professional Certification: Entry (openBIM / IFC)</w:t>
+      </w:r>
+      <w:r>
+        <w:rPr>
+          <w:rFonts w:ascii="Arial" w:hAnsi="Arial" w:cs="Arial"/>
+          <w:sz w:val="20"/>
+          <w:szCs w:val="20"/>
+        </w:rPr>
+        <w:br/>
+      </w:r>
+      <w:r>
+        <w:rPr>
+          <w:rFonts w:ascii="Arial" w:hAnsi="Arial" w:cs="Arial"/>
+          <w:i/>
+          <w:iCs/>
+          <w:sz w:val="20"/>
+          <w:szCs w:val="20"/>
+        </w:rPr>
+        <w:t>2026</w:t>
+      </w:r>
+    </w:p>
+    <w:p>
+      <w:pPr>
+        <w:rPr>
+          <w:rFonts w:ascii="Arial" w:hAnsi="Arial" w:cs="Arial"/>
+          <w:sz w:val="20"/>
+          <w:szCs w:val="20"/>
+        </w:rPr>
+      </w:pPr>
+      <w:r>
+        <w:rPr>
+          <w:rFonts w:ascii="Arial" w:hAnsi="Arial" w:cs="Arial"/>
+          <w:b/>
+          <w:bCs/>
+          <w:sz w:val="20"/>
+          <w:szCs w:val="20"/>
+        </w:rPr>
+        <w:t>Deakin University – SEED-AI (Skills for Education, Employment and Digital AI)</w:t>
+      </w:r>
+      <w:r>
+        <w:rPr>
+          <w:rFonts w:ascii="Arial" w:hAnsi="Arial" w:cs="Arial"/>
+          <w:sz w:val="20"/>
+          <w:szCs w:val="20"/>
+        </w:rPr>
+        <w:br/>
+      </w:r>
+      <w:r>
+        <w:rPr>
+          <w:rFonts w:ascii="Arial" w:hAnsi="Arial" w:cs="Arial"/>
+          <w:i/>
+          <w:iCs/>
+          <w:sz w:val="20"/>
+          <w:szCs w:val="20"/>
+        </w:rPr>
+        <w:t>Oct 2026</w:t>
+      </w:r>
+    </w:p>
+    <w:p>
+      <w:pPr>
+        <w:rPr>
+          <w:rFonts w:ascii="Arial" w:hAnsi="Arial" w:cs="Arial"/>
           <w:b/>
           <w:bCs/>
           <w:color w:val="80340D" w:themeColor="accent2" w:themeShade="80"/>
@@ -829,7 +903,7 @@
           <w:sz w:val="20"/>
           <w:szCs w:val="20"/>
         </w:rPr>
-        <w:t>Apr 2024 – Present</w:t>
+        <w:t>Apr 2024 – Oct 2026</w:t>
       </w:r>
     </w:p>
     <w:p>

</xml_diff>